<commit_message>
Phase 1: Professional Consultant Workflow Redesign
</commit_message>
<xml_diff>
--- a/validation_reports/scenario_1_report.docx
+++ b/validation_reports/scenario_1_report.docx
@@ -2,6 +2,21 @@
 <file path=word/document.xml><?xml version="1.0" encoding="utf-8"?>
 <w:document xmlns:wpc="http://schemas.microsoft.com/office/word/2010/wordprocessingCanvas" xmlns:mo="http://schemas.microsoft.com/office/mac/office/2008/main" xmlns:mc="http://schemas.openxmlformats.org/markup-compatibility/2006" xmlns:mv="urn:schemas-microsoft-com:mac:vml" xmlns:o="urn:schemas-microsoft-com:office:office" xmlns:r="http://schemas.openxmlformats.org/officeDocument/2006/relationships" xmlns:m="http://schemas.openxmlformats.org/officeDocument/2006/math" xmlns:v="urn:schemas-microsoft-com:vml" xmlns:wp14="http://schemas.microsoft.com/office/word/2010/wordprocessingDrawing" xmlns:wp="http://schemas.openxmlformats.org/drawingml/2006/wordprocessingDrawing" xmlns:w10="urn:schemas-microsoft-com:office:word" xmlns:w="http://schemas.openxmlformats.org/wordprocessingml/2006/main" xmlns:w14="http://schemas.microsoft.com/office/word/2010/wordml" xmlns:wpg="http://schemas.microsoft.com/office/word/2010/wordprocessingGroup" xmlns:wpi="http://schemas.microsoft.com/office/word/2010/wordprocessingInk" xmlns:wne="http://schemas.microsoft.com/office/word/2006/wordml" xmlns:wps="http://schemas.microsoft.com/office/word/2010/wordprocessingShape" mc:Ignorable="w14 wp14">
   <w:body>
+    <w:p>
+      <w:pPr>
+        <w:jc w:val="left"/>
+      </w:pPr>
+      <w:r>
+        <w:rPr>
+          <w:rFonts w:ascii="Arial" w:hAnsi="Arial"/>
+          <w:b w:val="0"/>
+          <w:i w:val="0"/>
+          <w:sz w:val="22"/>
+        </w:rPr>
+        <w:br/>
+        <w:br/>
+      </w:r>
+    </w:p>
     <w:p>
       <w:pPr>
         <w:spacing w:before="160" w:after="80"/>
@@ -14,7 +29,36 @@
           <w:color w:val="1F3A68"/>
           <w:sz w:val="28"/>
         </w:rPr>
-        <w:t>COMBINED PAVEMENT-DESIGN REPORT</w:t>
+        <w:t>SAMPAVE ENGINEERING SUITE</w:t>
+      </w:r>
+    </w:p>
+    <w:p>
+      <w:pPr>
+        <w:spacing w:before="160" w:after="80"/>
+        <w:jc w:val="center"/>
+      </w:pPr>
+      <w:r>
+        <w:rPr>
+          <w:rFonts w:ascii="Arial" w:hAnsi="Arial"/>
+          <w:b/>
+          <w:color w:val="1F3A68"/>
+          <w:sz w:val="24"/>
+        </w:rPr>
+        <w:t>PROFESSIONAL PAVEMENT DESIGN REPORT</w:t>
+      </w:r>
+    </w:p>
+    <w:p>
+      <w:pPr>
+        <w:jc w:val="left"/>
+      </w:pPr>
+      <w:r>
+        <w:rPr>
+          <w:rFonts w:ascii="Arial" w:hAnsi="Arial"/>
+          <w:b w:val="0"/>
+          <w:i w:val="0"/>
+          <w:sz w:val="22"/>
+        </w:rPr>
+        <w:br/>
       </w:r>
     </w:p>
     <w:p>
@@ -26,9 +70,9 @@
           <w:rFonts w:ascii="Arial" w:hAnsi="Arial"/>
           <w:b/>
           <w:i w:val="0"/>
-          <w:sz w:val="24"/>
+          <w:sz w:val="22"/>
         </w:rPr>
-        <w:t>SamPave Report - Low traffic + medium CBR</w:t>
+        <w:t>Name of Work:</w:t>
       </w:r>
     </w:p>
     <w:p>
@@ -38,26 +82,25 @@
       <w:r>
         <w:rPr>
           <w:rFonts w:ascii="Arial" w:hAnsi="Arial"/>
-          <w:b w:val="0"/>
+          <w:b/>
           <w:i w:val="0"/>
-          <w:sz w:val="20"/>
+          <w:sz w:val="30"/>
         </w:rPr>
-        <w:t>Pavement Laboratory  •  Report Date: 22-Jun-2026</w:t>
+        <w:t>Low Traffic + Medium CBR Demo</w:t>
       </w:r>
     </w:p>
     <w:p>
       <w:pPr>
-        <w:spacing w:before="160" w:after="80"/>
         <w:jc w:val="left"/>
       </w:pPr>
       <w:r>
         <w:rPr>
           <w:rFonts w:ascii="Arial" w:hAnsi="Arial"/>
-          <w:b/>
-          <w:color w:val="1F3A68"/>
-          <w:sz w:val="24"/>
+          <w:b w:val="0"/>
+          <w:i w:val="0"/>
+          <w:sz w:val="22"/>
         </w:rPr>
-        <w:t>Project Information</w:t>
+        <w:br/>
       </w:r>
     </w:p>
     <w:tbl>
@@ -131,47 +174,7 @@
                 <w:b w:val="0"/>
                 <w:sz w:val="20"/>
               </w:rPr>
-              <w:t>Name of Work</w:t>
-            </w:r>
-          </w:p>
-        </w:tc>
-        <w:tc>
-          <w:tcPr>
-            <w:tcW w:type="dxa" w:w="4801"/>
-            <w:vAlign w:val="center"/>
-          </w:tcPr>
-          <w:p>
-            <w:pPr>
-              <w:jc w:val="center"/>
-            </w:pPr>
-            <w:r>
-              <w:rPr>
-                <w:rFonts w:ascii="Arial" w:hAnsi="Arial"/>
-                <w:b w:val="0"/>
-                <w:sz w:val="20"/>
-              </w:rPr>
-              <w:t>Low Traffic + Medium CBR Demo</w:t>
-            </w:r>
-          </w:p>
-        </w:tc>
-      </w:tr>
-      <w:tr>
-        <w:tc>
-          <w:tcPr>
-            <w:tcW w:type="dxa" w:w="4801"/>
-            <w:vAlign w:val="center"/>
-          </w:tcPr>
-          <w:p>
-            <w:pPr>
-              <w:jc w:val="left"/>
-            </w:pPr>
-            <w:r>
-              <w:rPr>
-                <w:rFonts w:ascii="Arial" w:hAnsi="Arial"/>
-                <w:b w:val="0"/>
-                <w:sz w:val="20"/>
-              </w:rPr>
-              <w:t>Client</w:t>
+              <w:t>Client Name</w:t>
             </w:r>
           </w:p>
         </w:tc>
@@ -211,7 +214,7 @@
                 <w:b w:val="0"/>
                 <w:sz w:val="20"/>
               </w:rPr>
-              <w:t>Agency</w:t>
+              <w:t>Consulting Firm</w:t>
             </w:r>
           </w:p>
         </w:tc>
@@ -230,7 +233,7 @@
                 <w:b w:val="0"/>
                 <w:sz w:val="20"/>
               </w:rPr>
-              <w:t>Arcstone Infrastructure</w:t>
+              <w:t>Pavement Engineering Consultants</w:t>
             </w:r>
           </w:p>
         </w:tc>
@@ -251,7 +254,7 @@
                 <w:b w:val="0"/>
                 <w:sz w:val="20"/>
               </w:rPr>
-              <w:t>Submitted By</w:t>
+              <w:t>Report Identifier</w:t>
             </w:r>
           </w:p>
         </w:tc>
@@ -270,12 +273,114 @@
                 <w:b w:val="0"/>
                 <w:sz w:val="20"/>
               </w:rPr>
-              <w:t>QA Validator</w:t>
+              <w:t>RP-1-20260624</w:t>
+            </w:r>
+          </w:p>
+        </w:tc>
+      </w:tr>
+      <w:tr>
+        <w:tc>
+          <w:tcPr>
+            <w:tcW w:type="dxa" w:w="4801"/>
+            <w:vAlign w:val="center"/>
+          </w:tcPr>
+          <w:p>
+            <w:pPr>
+              <w:jc w:val="left"/>
+            </w:pPr>
+            <w:r>
+              <w:rPr>
+                <w:rFonts w:ascii="Arial" w:hAnsi="Arial"/>
+                <w:b w:val="0"/>
+                <w:sz w:val="20"/>
+              </w:rPr>
+              <w:t>Submission Date</w:t>
+            </w:r>
+          </w:p>
+        </w:tc>
+        <w:tc>
+          <w:tcPr>
+            <w:tcW w:type="dxa" w:w="4801"/>
+            <w:vAlign w:val="center"/>
+          </w:tcPr>
+          <w:p>
+            <w:pPr>
+              <w:jc w:val="center"/>
+            </w:pPr>
+            <w:r>
+              <w:rPr>
+                <w:rFonts w:ascii="Arial" w:hAnsi="Arial"/>
+                <w:b w:val="0"/>
+                <w:sz w:val="20"/>
+              </w:rPr>
+              <w:t>24-Jun-2026</w:t>
             </w:r>
           </w:p>
         </w:tc>
       </w:tr>
     </w:tbl>
+    <w:p>
+      <w:pPr>
+        <w:jc w:val="left"/>
+      </w:pPr>
+      <w:r>
+        <w:rPr>
+          <w:rFonts w:ascii="Arial" w:hAnsi="Arial"/>
+          <w:b w:val="0"/>
+          <w:i w:val="0"/>
+          <w:sz w:val="22"/>
+        </w:rPr>
+        <w:br/>
+        <w:br/>
+      </w:r>
+    </w:p>
+    <w:p>
+      <w:pPr>
+        <w:jc w:val="center"/>
+      </w:pPr>
+      <w:r>
+        <w:rPr>
+          <w:rFonts w:ascii="Arial" w:hAnsi="Arial"/>
+          <w:b w:val="0"/>
+          <w:i w:val="0"/>
+          <w:sz w:val="20"/>
+        </w:rPr>
+        <w:t>========================================================================</w:t>
+      </w:r>
+    </w:p>
+    <w:p>
+      <w:pPr>
+        <w:jc w:val="center"/>
+      </w:pPr>
+      <w:r>
+        <w:rPr>
+          <w:rFonts w:ascii="Arial" w:hAnsi="Arial"/>
+          <w:b/>
+          <w:i w:val="0"/>
+          <w:sz w:val="20"/>
+        </w:rPr>
+        <w:t>IMPORTANT NOTICE: Submission package is decision-support documentation. Final field execution requires review and sign-off by a qualified pavement engineer.</w:t>
+      </w:r>
+    </w:p>
+    <w:p>
+      <w:pPr>
+        <w:jc w:val="center"/>
+      </w:pPr>
+      <w:r>
+        <w:rPr>
+          <w:rFonts w:ascii="Arial" w:hAnsi="Arial"/>
+          <w:b w:val="0"/>
+          <w:i w:val="0"/>
+          <w:sz w:val="20"/>
+        </w:rPr>
+        <w:t>========================================================================</w:t>
+      </w:r>
+    </w:p>
+    <w:p>
+      <w:r>
+        <w:br w:type="page"/>
+      </w:r>
+    </w:p>
     <w:p>
       <w:pPr>
         <w:spacing w:before="160" w:after="80"/>
@@ -342,6 +447,46 @@
                 <w:sz w:val="20"/>
               </w:rPr>
               <w:t>Governing Reference</w:t>
+            </w:r>
+          </w:p>
+        </w:tc>
+      </w:tr>
+      <w:tr>
+        <w:tc>
+          <w:tcPr>
+            <w:tcW w:type="dxa" w:w="4801"/>
+            <w:vAlign w:val="center"/>
+          </w:tcPr>
+          <w:p>
+            <w:pPr>
+              <w:jc w:val="left"/>
+            </w:pPr>
+            <w:r>
+              <w:rPr>
+                <w:rFonts w:ascii="Arial" w:hAnsi="Arial"/>
+                <w:b w:val="0"/>
+                <w:sz w:val="20"/>
+              </w:rPr>
+              <w:t>Executive Summary</w:t>
+            </w:r>
+          </w:p>
+        </w:tc>
+        <w:tc>
+          <w:tcPr>
+            <w:tcW w:type="dxa" w:w="4801"/>
+            <w:vAlign w:val="center"/>
+          </w:tcPr>
+          <w:p>
+            <w:pPr>
+              <w:jc w:val="center"/>
+            </w:pPr>
+            <w:r>
+              <w:rPr>
+                <w:rFonts w:ascii="Arial" w:hAnsi="Arial"/>
+                <w:b w:val="0"/>
+                <w:sz w:val="20"/>
+              </w:rPr>
+              <w:t>Project summary and engineering disclaimer</w:t>
             </w:r>
           </w:p>
         </w:tc>
@@ -466,7 +611,215 @@
           </w:p>
         </w:tc>
       </w:tr>
+      <w:tr>
+        <w:tc>
+          <w:tcPr>
+            <w:tcW w:type="dxa" w:w="4801"/>
+            <w:vAlign w:val="center"/>
+          </w:tcPr>
+          <w:p>
+            <w:pPr>
+              <w:jc w:val="left"/>
+            </w:pPr>
+            <w:r>
+              <w:rPr>
+                <w:rFonts w:ascii="Arial" w:hAnsi="Arial"/>
+                <w:b w:val="0"/>
+                <w:sz w:val="20"/>
+              </w:rPr>
+              <w:t>Assumptions Sheet</w:t>
+            </w:r>
+          </w:p>
+        </w:tc>
+        <w:tc>
+          <w:tcPr>
+            <w:tcW w:type="dxa" w:w="4801"/>
+            <w:vAlign w:val="center"/>
+          </w:tcPr>
+          <w:p>
+            <w:pPr>
+              <w:jc w:val="center"/>
+            </w:pPr>
+            <w:r>
+              <w:rPr>
+                <w:rFonts w:ascii="Arial" w:hAnsi="Arial"/>
+                <w:b w:val="0"/>
+                <w:sz w:val="20"/>
+              </w:rPr>
+              <w:t>Poisson's ratios, moduli, and growth presets</w:t>
+            </w:r>
+          </w:p>
+        </w:tc>
+      </w:tr>
+      <w:tr>
+        <w:tc>
+          <w:tcPr>
+            <w:tcW w:type="dxa" w:w="4801"/>
+            <w:vAlign w:val="center"/>
+          </w:tcPr>
+          <w:p>
+            <w:pPr>
+              <w:jc w:val="left"/>
+            </w:pPr>
+            <w:r>
+              <w:rPr>
+                <w:rFonts w:ascii="Arial" w:hAnsi="Arial"/>
+                <w:b w:val="0"/>
+                <w:sz w:val="20"/>
+              </w:rPr>
+              <w:t>Limitations of the Report</w:t>
+            </w:r>
+          </w:p>
+        </w:tc>
+        <w:tc>
+          <w:tcPr>
+            <w:tcW w:type="dxa" w:w="4801"/>
+            <w:vAlign w:val="center"/>
+          </w:tcPr>
+          <w:p>
+            <w:pPr>
+              <w:jc w:val="center"/>
+            </w:pPr>
+            <w:r>
+              <w:rPr>
+                <w:rFonts w:ascii="Arial" w:hAnsi="Arial"/>
+                <w:b w:val="0"/>
+                <w:sz w:val="20"/>
+              </w:rPr>
+              <w:t>Engineering screening disclaimers</w:t>
+            </w:r>
+          </w:p>
+        </w:tc>
+      </w:tr>
+      <w:tr>
+        <w:tc>
+          <w:tcPr>
+            <w:tcW w:type="dxa" w:w="4801"/>
+            <w:vAlign w:val="center"/>
+          </w:tcPr>
+          <w:p>
+            <w:pPr>
+              <w:jc w:val="left"/>
+            </w:pPr>
+            <w:r>
+              <w:rPr>
+                <w:rFonts w:ascii="Arial" w:hAnsi="Arial"/>
+                <w:b w:val="0"/>
+                <w:sz w:val="20"/>
+              </w:rPr>
+              <w:t>Engineer Review Checklist</w:t>
+            </w:r>
+          </w:p>
+        </w:tc>
+        <w:tc>
+          <w:tcPr>
+            <w:tcW w:type="dxa" w:w="4801"/>
+            <w:vAlign w:val="center"/>
+          </w:tcPr>
+          <w:p>
+            <w:pPr>
+              <w:jc w:val="center"/>
+            </w:pPr>
+            <w:r>
+              <w:rPr>
+                <w:rFonts w:ascii="Arial" w:hAnsi="Arial"/>
+                <w:b w:val="0"/>
+                <w:sz w:val="20"/>
+              </w:rPr>
+              <w:t>Checklist verification list</w:t>
+            </w:r>
+          </w:p>
+        </w:tc>
+      </w:tr>
+      <w:tr>
+        <w:tc>
+          <w:tcPr>
+            <w:tcW w:type="dxa" w:w="4801"/>
+            <w:vAlign w:val="center"/>
+          </w:tcPr>
+          <w:p>
+            <w:pPr>
+              <w:jc w:val="left"/>
+            </w:pPr>
+            <w:r>
+              <w:rPr>
+                <w:rFonts w:ascii="Arial" w:hAnsi="Arial"/>
+                <w:b w:val="0"/>
+                <w:sz w:val="20"/>
+              </w:rPr>
+              <w:t>Engineering Sign-Off and Seal</w:t>
+            </w:r>
+          </w:p>
+        </w:tc>
+        <w:tc>
+          <w:tcPr>
+            <w:tcW w:type="dxa" w:w="4801"/>
+            <w:vAlign w:val="center"/>
+          </w:tcPr>
+          <w:p>
+            <w:pPr>
+              <w:jc w:val="center"/>
+            </w:pPr>
+            <w:r>
+              <w:rPr>
+                <w:rFonts w:ascii="Arial" w:hAnsi="Arial"/>
+                <w:b w:val="0"/>
+                <w:sz w:val="20"/>
+              </w:rPr>
+              <w:t>Reviewer signatures</w:t>
+            </w:r>
+          </w:p>
+        </w:tc>
+      </w:tr>
     </w:tbl>
+    <w:p>
+      <w:r>
+        <w:br w:type="page"/>
+      </w:r>
+    </w:p>
+    <w:p>
+      <w:pPr>
+        <w:spacing w:before="160" w:after="80"/>
+        <w:jc w:val="left"/>
+      </w:pPr>
+      <w:r>
+        <w:rPr>
+          <w:rFonts w:ascii="Arial" w:hAnsi="Arial"/>
+          <w:b/>
+          <w:color w:val="1F3A68"/>
+          <w:sz w:val="28"/>
+        </w:rPr>
+        <w:t>EXECUTIVE SUMMARY</w:t>
+      </w:r>
+    </w:p>
+    <w:p>
+      <w:pPr>
+        <w:jc w:val="left"/>
+      </w:pPr>
+      <w:r>
+        <w:rPr>
+          <w:rFonts w:ascii="Arial" w:hAnsi="Arial"/>
+          <w:b w:val="0"/>
+          <w:i w:val="0"/>
+          <w:sz w:val="22"/>
+        </w:rPr>
+        <w:t>This professional pavement design report presents the mechanistic and empirical design parameters established for the work 'Low Traffic + Medium CBR Demo'. The evaluation incorporates design traffic analysis, subgrade pavement layer profiling, and mechanistic safety screening. A conventional flexible pavement design has been developed for a design traffic of 0.69 MSA, resulting in a total pavement thickness of 570 mm. The design calculations have been prepared under Decision Support Mode guidelines.</w:t>
+      </w:r>
+    </w:p>
+    <w:p>
+      <w:pPr>
+        <w:jc w:val="left"/>
+      </w:pPr>
+      <w:r>
+        <w:rPr>
+          <w:rFonts w:ascii="Arial" w:hAnsi="Arial"/>
+          <w:b w:val="0"/>
+          <w:i/>
+          <w:sz w:val="18"/>
+        </w:rPr>
+        <w:t>Disclaimer: This Engineering Intelligence Review and report is a decision-support screening tool. Final design acceptance for construction field execution remains subject to independent review and sign-off by a qualified pavement engineer.</w:t>
+      </w:r>
+    </w:p>
     <w:p>
       <w:r>
         <w:br w:type="page"/>
@@ -592,7 +945,7 @@
                 <w:b w:val="0"/>
                 <w:sz w:val="20"/>
               </w:rPr>
-              <w:t>2026-06-22 15:56:08</w:t>
+              <w:t>2026-06-24 11:59:33</w:t>
             </w:r>
           </w:p>
         </w:tc>
@@ -1325,7 +1678,7 @@
           <w:i w:val="0"/>
           <w:sz w:val="20"/>
         </w:rPr>
-        <w:t>Pavement Laboratory  •  Report Date: 22-Jun-2026</w:t>
+        <w:t>Pavement Laboratory  •  Report Date: 24-Jun-2026</w:t>
       </w:r>
     </w:p>
     <w:p>
@@ -3257,7 +3610,7 @@
           <w:i w:val="0"/>
           <w:sz w:val="20"/>
         </w:rPr>
-        <w:t>Pavement Laboratory  •  Report Date: 22-Jun-2026</w:t>
+        <w:t>Pavement Laboratory  •  Report Date: 24-Jun-2026</w:t>
       </w:r>
     </w:p>
     <w:p>
@@ -5526,23 +5879,22 @@
     </w:p>
     <w:p>
       <w:pPr>
-        <w:spacing w:before="40" w:after="120"/>
+        <w:spacing w:before="160" w:after="80"/>
         <w:jc w:val="left"/>
       </w:pPr>
       <w:r>
         <w:rPr>
           <w:rFonts w:ascii="Arial" w:hAnsi="Arial"/>
-          <w:i/>
-          <w:color w:val="555B6E"/>
-          <w:sz w:val="18"/>
+          <w:b/>
+          <w:color w:val="1F3A68"/>
+          <w:sz w:val="24"/>
         </w:rPr>
-        <w:t>References: IRC:37-2018 'Guidelines for the Design of Flexible Pavements' (Indian Roads Congress, 4th Revision).</w:t>
+        <w:t>ENGINEERING INTELLIGENCE REVIEW - Flexible Pavement Design</w:t>
       </w:r>
     </w:p>
-    <w:p/>
-    <w:p/>
     <w:tbl>
       <w:tblPr>
+        <w:tblStyle w:val="TableGrid"/>
         <w:tblW w:type="auto" w:w="0"/>
         <w:jc w:val="center"/>
         <w:tblLook w:firstColumn="1" w:firstRow="1" w:lastColumn="0" w:lastRow="0" w:noHBand="0" w:noVBand="1" w:val="04A0"/>
@@ -5555,6 +5907,7 @@
         <w:tc>
           <w:tcPr>
             <w:tcW w:type="dxa" w:w="4801"/>
+            <w:shd w:val="clear" w:color="auto" w:fill="1F3A68"/>
             <w:vAlign w:val="center"/>
           </w:tcPr>
           <w:p>
@@ -5564,13 +5917,53 @@
             <w:r>
               <w:rPr>
                 <w:rFonts w:ascii="Arial" w:hAnsi="Arial"/>
+                <w:b/>
+                <w:color w:val="FFFFFF"/>
+                <w:sz w:val="20"/>
+              </w:rPr>
+              <w:t>Item</w:t>
+            </w:r>
+          </w:p>
+        </w:tc>
+        <w:tc>
+          <w:tcPr>
+            <w:tcW w:type="dxa" w:w="4801"/>
+            <w:shd w:val="clear" w:color="auto" w:fill="1F3A68"/>
+            <w:vAlign w:val="center"/>
+          </w:tcPr>
+          <w:p>
+            <w:pPr>
+              <w:jc w:val="center"/>
+            </w:pPr>
+            <w:r>
+              <w:rPr>
+                <w:rFonts w:ascii="Arial" w:hAnsi="Arial"/>
+                <w:b/>
+                <w:color w:val="FFFFFF"/>
+                <w:sz w:val="20"/>
+              </w:rPr>
+              <w:t>Detail</w:t>
+            </w:r>
+          </w:p>
+        </w:tc>
+      </w:tr>
+      <w:tr>
+        <w:tc>
+          <w:tcPr>
+            <w:tcW w:type="dxa" w:w="4801"/>
+            <w:vAlign w:val="center"/>
+          </w:tcPr>
+          <w:p>
+            <w:pPr>
+              <w:jc w:val="left"/>
+            </w:pPr>
+            <w:r>
+              <w:rPr>
+                <w:rFonts w:ascii="Arial" w:hAnsi="Arial"/>
                 <w:b w:val="0"/>
                 <w:sz w:val="20"/>
               </w:rPr>
-              <w:t>Prepared By</w:t>
-              <w:br/>
-              <w:br/>
-              <w:t>______________________</w:t>
+              <w:t>Engineering Screening Score</w:t>
             </w:r>
           </w:p>
         </w:tc>
@@ -5589,15 +5982,1350 @@
                 <w:b w:val="0"/>
                 <w:sz w:val="20"/>
               </w:rPr>
-              <w:t>Approved By</w:t>
-              <w:br/>
-              <w:br/>
-              <w:t>______________________</w:t>
+              <w:t>100 / 100</w:t>
+            </w:r>
+          </w:p>
+        </w:tc>
+      </w:tr>
+      <w:tr>
+        <w:tc>
+          <w:tcPr>
+            <w:tcW w:type="dxa" w:w="4801"/>
+            <w:vAlign w:val="center"/>
+          </w:tcPr>
+          <w:p>
+            <w:pPr>
+              <w:jc w:val="left"/>
+            </w:pPr>
+            <w:r>
+              <w:rPr>
+                <w:rFonts w:ascii="Arial" w:hAnsi="Arial"/>
+                <w:b w:val="0"/>
+                <w:sz w:val="20"/>
+              </w:rPr>
+              <w:t>Risk Classification</w:t>
+            </w:r>
+          </w:p>
+        </w:tc>
+        <w:tc>
+          <w:tcPr>
+            <w:tcW w:type="dxa" w:w="4801"/>
+            <w:vAlign w:val="center"/>
+          </w:tcPr>
+          <w:p>
+            <w:pPr>
+              <w:jc w:val="center"/>
+            </w:pPr>
+            <w:r>
+              <w:rPr>
+                <w:rFonts w:ascii="Arial" w:hAnsi="Arial"/>
+                <w:b w:val="0"/>
+                <w:sz w:val="20"/>
+              </w:rPr>
+              <w:t>Healthy</w:t>
             </w:r>
           </w:p>
         </w:tc>
       </w:tr>
     </w:tbl>
+    <w:p>
+      <w:pPr>
+        <w:spacing w:before="160" w:after="80"/>
+        <w:jc w:val="left"/>
+      </w:pPr>
+      <w:r>
+        <w:rPr>
+          <w:rFonts w:ascii="Arial" w:hAnsi="Arial"/>
+          <w:b/>
+          <w:sz w:val="22"/>
+        </w:rPr>
+        <w:t>Design Compatibility Screening Alerts</w:t>
+      </w:r>
+    </w:p>
+    <w:p>
+      <w:pPr>
+        <w:jc w:val="left"/>
+      </w:pPr>
+      <w:r>
+        <w:rPr>
+          <w:rFonts w:ascii="Arial" w:hAnsi="Arial"/>
+          <w:b w:val="0"/>
+          <w:i w:val="0"/>
+          <w:sz w:val="22"/>
+        </w:rPr>
+        <w:t>No design compatibility alerts flagged. The layer stack modular ratios and thicknesses are within standard screening ranges.</w:t>
+      </w:r>
+    </w:p>
+    <w:p>
+      <w:pPr>
+        <w:spacing w:before="160" w:after="80"/>
+        <w:jc w:val="left"/>
+      </w:pPr>
+      <w:r>
+        <w:rPr>
+          <w:rFonts w:ascii="Arial" w:hAnsi="Arial"/>
+          <w:b/>
+          <w:sz w:val="22"/>
+        </w:rPr>
+        <w:t>Engineering Review Remarks</w:t>
+      </w:r>
+    </w:p>
+    <w:p>
+      <w:pPr>
+        <w:jc w:val="left"/>
+      </w:pPr>
+      <w:r>
+        <w:rPr>
+          <w:rFonts w:ascii="Arial" w:hAnsi="Arial"/>
+          <w:b w:val="0"/>
+          <w:i w:val="0"/>
+          <w:sz w:val="22"/>
+        </w:rPr>
+        <w:t>• Pavement design shows excellent layer compatibility.</w:t>
+      </w:r>
+    </w:p>
+    <w:p>
+      <w:pPr>
+        <w:jc w:val="left"/>
+      </w:pPr>
+      <w:r>
+        <w:rPr>
+          <w:rFonts w:ascii="Arial" w:hAnsi="Arial"/>
+          <w:b w:val="0"/>
+          <w:i w:val="0"/>
+          <w:sz w:val="22"/>
+        </w:rPr>
+        <w:t>• Review is based on static pavement guidelines. Final designs must be mechanistically validated in IITPAVE.</w:t>
+      </w:r>
+    </w:p>
+    <w:p>
+      <w:pPr>
+        <w:jc w:val="left"/>
+      </w:pPr>
+      <w:r>
+        <w:rPr>
+          <w:rFonts w:ascii="Arial" w:hAnsi="Arial"/>
+          <w:b w:val="0"/>
+          <w:i/>
+          <w:sz w:val="18"/>
+        </w:rPr>
+        <w:t>Disclaimer: This Engineering Intelligence Review is a decision-support screening tool. Final design acceptance requires independent review and sign-off by a qualified pavement engineer. The Engineering Screening Score is a mathematical index based on typical ranges and does not constitute final safety approval or certification.</w:t>
+      </w:r>
+    </w:p>
+    <w:p>
+      <w:pPr>
+        <w:spacing w:before="40" w:after="120"/>
+        <w:jc w:val="left"/>
+      </w:pPr>
+      <w:r>
+        <w:rPr>
+          <w:rFonts w:ascii="Arial" w:hAnsi="Arial"/>
+          <w:i/>
+          <w:color w:val="555B6E"/>
+          <w:sz w:val="18"/>
+        </w:rPr>
+        <w:t>References: IRC:37-2018 'Guidelines for the Design of Flexible Pavements' (Indian Roads Congress, 4th Revision).</w:t>
+      </w:r>
+    </w:p>
+    <w:p>
+      <w:r>
+        <w:br w:type="page"/>
+      </w:r>
+    </w:p>
+    <w:p>
+      <w:pPr>
+        <w:spacing w:before="160" w:after="80"/>
+        <w:jc w:val="center"/>
+      </w:pPr>
+      <w:r>
+        <w:rPr>
+          <w:rFonts w:ascii="Arial" w:hAnsi="Arial"/>
+          <w:b/>
+          <w:color w:val="1F3A68"/>
+          <w:sz w:val="28"/>
+        </w:rPr>
+        <w:t>ENGINEERING INTELLIGENCE REVIEW</w:t>
+      </w:r>
+    </w:p>
+    <w:p>
+      <w:pPr>
+        <w:jc w:val="center"/>
+      </w:pPr>
+      <w:r>
+        <w:rPr>
+          <w:rFonts w:ascii="Arial" w:hAnsi="Arial"/>
+          <w:b w:val="0"/>
+          <w:i/>
+          <w:sz w:val="20"/>
+        </w:rPr>
+        <w:t>Design screening checks based on static layer modular ratios, thicknesses, and material tier compatibility.</w:t>
+      </w:r>
+    </w:p>
+    <w:p>
+      <w:pPr>
+        <w:spacing w:before="160" w:after="80"/>
+        <w:jc w:val="left"/>
+      </w:pPr>
+      <w:r>
+        <w:rPr>
+          <w:rFonts w:ascii="Arial" w:hAnsi="Arial"/>
+          <w:b/>
+          <w:color w:val="1F3A68"/>
+          <w:sz w:val="24"/>
+        </w:rPr>
+        <w:t>ENGINEERING INTELLIGENCE REVIEW - Flexible Pavement Design</w:t>
+      </w:r>
+    </w:p>
+    <w:tbl>
+      <w:tblPr>
+        <w:tblStyle w:val="TableGrid"/>
+        <w:tblW w:type="auto" w:w="0"/>
+        <w:jc w:val="center"/>
+        <w:tblLook w:firstColumn="1" w:firstRow="1" w:lastColumn="0" w:lastRow="0" w:noHBand="0" w:noVBand="1" w:val="04A0"/>
+      </w:tblPr>
+      <w:tblGrid>
+        <w:gridCol w:w="4801"/>
+        <w:gridCol w:w="4801"/>
+      </w:tblGrid>
+      <w:tr>
+        <w:tc>
+          <w:tcPr>
+            <w:tcW w:type="dxa" w:w="4801"/>
+            <w:shd w:val="clear" w:color="auto" w:fill="1F3A68"/>
+            <w:vAlign w:val="center"/>
+          </w:tcPr>
+          <w:p>
+            <w:pPr>
+              <w:jc w:val="center"/>
+            </w:pPr>
+            <w:r>
+              <w:rPr>
+                <w:rFonts w:ascii="Arial" w:hAnsi="Arial"/>
+                <w:b/>
+                <w:color w:val="FFFFFF"/>
+                <w:sz w:val="20"/>
+              </w:rPr>
+              <w:t>Item</w:t>
+            </w:r>
+          </w:p>
+        </w:tc>
+        <w:tc>
+          <w:tcPr>
+            <w:tcW w:type="dxa" w:w="4801"/>
+            <w:shd w:val="clear" w:color="auto" w:fill="1F3A68"/>
+            <w:vAlign w:val="center"/>
+          </w:tcPr>
+          <w:p>
+            <w:pPr>
+              <w:jc w:val="center"/>
+            </w:pPr>
+            <w:r>
+              <w:rPr>
+                <w:rFonts w:ascii="Arial" w:hAnsi="Arial"/>
+                <w:b/>
+                <w:color w:val="FFFFFF"/>
+                <w:sz w:val="20"/>
+              </w:rPr>
+              <w:t>Detail</w:t>
+            </w:r>
+          </w:p>
+        </w:tc>
+      </w:tr>
+      <w:tr>
+        <w:tc>
+          <w:tcPr>
+            <w:tcW w:type="dxa" w:w="4801"/>
+            <w:vAlign w:val="center"/>
+          </w:tcPr>
+          <w:p>
+            <w:pPr>
+              <w:jc w:val="left"/>
+            </w:pPr>
+            <w:r>
+              <w:rPr>
+                <w:rFonts w:ascii="Arial" w:hAnsi="Arial"/>
+                <w:b w:val="0"/>
+                <w:sz w:val="20"/>
+              </w:rPr>
+              <w:t>Engineering Screening Score</w:t>
+            </w:r>
+          </w:p>
+        </w:tc>
+        <w:tc>
+          <w:tcPr>
+            <w:tcW w:type="dxa" w:w="4801"/>
+            <w:vAlign w:val="center"/>
+          </w:tcPr>
+          <w:p>
+            <w:pPr>
+              <w:jc w:val="center"/>
+            </w:pPr>
+            <w:r>
+              <w:rPr>
+                <w:rFonts w:ascii="Arial" w:hAnsi="Arial"/>
+                <w:b w:val="0"/>
+                <w:sz w:val="20"/>
+              </w:rPr>
+              <w:t>100 / 100</w:t>
+            </w:r>
+          </w:p>
+        </w:tc>
+      </w:tr>
+      <w:tr>
+        <w:tc>
+          <w:tcPr>
+            <w:tcW w:type="dxa" w:w="4801"/>
+            <w:vAlign w:val="center"/>
+          </w:tcPr>
+          <w:p>
+            <w:pPr>
+              <w:jc w:val="left"/>
+            </w:pPr>
+            <w:r>
+              <w:rPr>
+                <w:rFonts w:ascii="Arial" w:hAnsi="Arial"/>
+                <w:b w:val="0"/>
+                <w:sz w:val="20"/>
+              </w:rPr>
+              <w:t>Risk Classification</w:t>
+            </w:r>
+          </w:p>
+        </w:tc>
+        <w:tc>
+          <w:tcPr>
+            <w:tcW w:type="dxa" w:w="4801"/>
+            <w:vAlign w:val="center"/>
+          </w:tcPr>
+          <w:p>
+            <w:pPr>
+              <w:jc w:val="center"/>
+            </w:pPr>
+            <w:r>
+              <w:rPr>
+                <w:rFonts w:ascii="Arial" w:hAnsi="Arial"/>
+                <w:b w:val="0"/>
+                <w:sz w:val="20"/>
+              </w:rPr>
+              <w:t>Healthy</w:t>
+            </w:r>
+          </w:p>
+        </w:tc>
+      </w:tr>
+    </w:tbl>
+    <w:p>
+      <w:pPr>
+        <w:spacing w:before="160" w:after="80"/>
+        <w:jc w:val="left"/>
+      </w:pPr>
+      <w:r>
+        <w:rPr>
+          <w:rFonts w:ascii="Arial" w:hAnsi="Arial"/>
+          <w:b/>
+          <w:sz w:val="22"/>
+        </w:rPr>
+        <w:t>Design Compatibility Screening Alerts</w:t>
+      </w:r>
+    </w:p>
+    <w:p>
+      <w:pPr>
+        <w:jc w:val="left"/>
+      </w:pPr>
+      <w:r>
+        <w:rPr>
+          <w:rFonts w:ascii="Arial" w:hAnsi="Arial"/>
+          <w:b w:val="0"/>
+          <w:i w:val="0"/>
+          <w:sz w:val="22"/>
+        </w:rPr>
+        <w:t>No design compatibility alerts flagged. The layer stack modular ratios and thicknesses are within standard screening ranges.</w:t>
+      </w:r>
+    </w:p>
+    <w:p>
+      <w:pPr>
+        <w:spacing w:before="160" w:after="80"/>
+        <w:jc w:val="left"/>
+      </w:pPr>
+      <w:r>
+        <w:rPr>
+          <w:rFonts w:ascii="Arial" w:hAnsi="Arial"/>
+          <w:b/>
+          <w:sz w:val="22"/>
+        </w:rPr>
+        <w:t>Engineering Review Remarks</w:t>
+      </w:r>
+    </w:p>
+    <w:p>
+      <w:pPr>
+        <w:jc w:val="left"/>
+      </w:pPr>
+      <w:r>
+        <w:rPr>
+          <w:rFonts w:ascii="Arial" w:hAnsi="Arial"/>
+          <w:b w:val="0"/>
+          <w:i w:val="0"/>
+          <w:sz w:val="22"/>
+        </w:rPr>
+        <w:t>• Pavement design shows excellent layer compatibility.</w:t>
+      </w:r>
+    </w:p>
+    <w:p>
+      <w:pPr>
+        <w:jc w:val="left"/>
+      </w:pPr>
+      <w:r>
+        <w:rPr>
+          <w:rFonts w:ascii="Arial" w:hAnsi="Arial"/>
+          <w:b w:val="0"/>
+          <w:i w:val="0"/>
+          <w:sz w:val="22"/>
+        </w:rPr>
+        <w:t>• Review is based on static pavement guidelines. Final designs must be mechanistically validated in IITPAVE.</w:t>
+      </w:r>
+    </w:p>
+    <w:p>
+      <w:pPr>
+        <w:jc w:val="left"/>
+      </w:pPr>
+      <w:r>
+        <w:rPr>
+          <w:rFonts w:ascii="Arial" w:hAnsi="Arial"/>
+          <w:b w:val="0"/>
+          <w:i/>
+          <w:sz w:val="18"/>
+        </w:rPr>
+        <w:t>Disclaimer: This Engineering Intelligence Review is a decision-support screening tool. Final design acceptance requires independent review and sign-off by a qualified pavement engineer. The Engineering Screening Score is a mathematical index based on typical ranges and does not constitute final safety approval or certification.</w:t>
+      </w:r>
+    </w:p>
+    <w:p>
+      <w:r>
+        <w:br w:type="page"/>
+      </w:r>
+    </w:p>
+    <w:p>
+      <w:pPr>
+        <w:spacing w:before="160" w:after="80"/>
+        <w:jc w:val="left"/>
+      </w:pPr>
+      <w:r>
+        <w:rPr>
+          <w:rFonts w:ascii="Arial" w:hAnsi="Arial"/>
+          <w:b/>
+          <w:color w:val="1F3A68"/>
+          <w:sz w:val="28"/>
+        </w:rPr>
+        <w:t>ASSUMPTIONS SHEET</w:t>
+      </w:r>
+    </w:p>
+    <w:p>
+      <w:pPr>
+        <w:jc w:val="left"/>
+      </w:pPr>
+      <w:r>
+        <w:rPr>
+          <w:rFonts w:ascii="Arial" w:hAnsi="Arial"/>
+          <w:b w:val="0"/>
+          <w:i w:val="0"/>
+          <w:sz w:val="22"/>
+        </w:rPr>
+        <w:t>The design is based on the following standard engineering assumptions and presets:</w:t>
+      </w:r>
+    </w:p>
+    <w:tbl>
+      <w:tblPr>
+        <w:tblStyle w:val="TableGrid"/>
+        <w:tblW w:type="auto" w:w="0"/>
+        <w:jc w:val="center"/>
+        <w:tblLook w:firstColumn="1" w:firstRow="1" w:lastColumn="0" w:lastRow="0" w:noHBand="0" w:noVBand="1" w:val="04A0"/>
+      </w:tblPr>
+      <w:tblGrid>
+        <w:gridCol w:w="4801"/>
+        <w:gridCol w:w="4801"/>
+      </w:tblGrid>
+      <w:tr>
+        <w:tc>
+          <w:tcPr>
+            <w:tcW w:type="dxa" w:w="4801"/>
+            <w:shd w:val="clear" w:color="auto" w:fill="1F3A68"/>
+            <w:vAlign w:val="center"/>
+          </w:tcPr>
+          <w:p>
+            <w:pPr>
+              <w:jc w:val="center"/>
+            </w:pPr>
+            <w:r>
+              <w:rPr>
+                <w:rFonts w:ascii="Arial" w:hAnsi="Arial"/>
+                <w:b/>
+                <w:color w:val="FFFFFF"/>
+                <w:sz w:val="20"/>
+              </w:rPr>
+              <w:t>Parameter Description</w:t>
+            </w:r>
+          </w:p>
+        </w:tc>
+        <w:tc>
+          <w:tcPr>
+            <w:tcW w:type="dxa" w:w="4801"/>
+            <w:shd w:val="clear" w:color="auto" w:fill="1F3A68"/>
+            <w:vAlign w:val="center"/>
+          </w:tcPr>
+          <w:p>
+            <w:pPr>
+              <w:jc w:val="center"/>
+            </w:pPr>
+            <w:r>
+              <w:rPr>
+                <w:rFonts w:ascii="Arial" w:hAnsi="Arial"/>
+                <w:b/>
+                <w:color w:val="FFFFFF"/>
+                <w:sz w:val="20"/>
+              </w:rPr>
+              <w:t>Assumed / Preset Value</w:t>
+            </w:r>
+          </w:p>
+        </w:tc>
+      </w:tr>
+      <w:tr>
+        <w:tc>
+          <w:tcPr>
+            <w:tcW w:type="dxa" w:w="4801"/>
+            <w:vAlign w:val="center"/>
+          </w:tcPr>
+          <w:p>
+            <w:pPr>
+              <w:jc w:val="left"/>
+            </w:pPr>
+            <w:r>
+              <w:rPr>
+                <w:rFonts w:ascii="Arial" w:hAnsi="Arial"/>
+                <w:b w:val="0"/>
+                <w:sz w:val="20"/>
+              </w:rPr>
+              <w:t>Poisson's Ratio (Bituminous Layer)</w:t>
+            </w:r>
+          </w:p>
+        </w:tc>
+        <w:tc>
+          <w:tcPr>
+            <w:tcW w:type="dxa" w:w="4801"/>
+            <w:vAlign w:val="center"/>
+          </w:tcPr>
+          <w:p>
+            <w:pPr>
+              <w:jc w:val="center"/>
+            </w:pPr>
+            <w:r>
+              <w:rPr>
+                <w:rFonts w:ascii="Arial" w:hAnsi="Arial"/>
+                <w:b w:val="0"/>
+                <w:sz w:val="20"/>
+              </w:rPr>
+              <w:t>0.35</w:t>
+            </w:r>
+          </w:p>
+        </w:tc>
+      </w:tr>
+      <w:tr>
+        <w:tc>
+          <w:tcPr>
+            <w:tcW w:type="dxa" w:w="4801"/>
+            <w:vAlign w:val="center"/>
+          </w:tcPr>
+          <w:p>
+            <w:pPr>
+              <w:jc w:val="left"/>
+            </w:pPr>
+            <w:r>
+              <w:rPr>
+                <w:rFonts w:ascii="Arial" w:hAnsi="Arial"/>
+                <w:b w:val="0"/>
+                <w:sz w:val="20"/>
+              </w:rPr>
+              <w:t>Poisson's Ratio (Granular Base/Sub-base)</w:t>
+            </w:r>
+          </w:p>
+        </w:tc>
+        <w:tc>
+          <w:tcPr>
+            <w:tcW w:type="dxa" w:w="4801"/>
+            <w:vAlign w:val="center"/>
+          </w:tcPr>
+          <w:p>
+            <w:pPr>
+              <w:jc w:val="center"/>
+            </w:pPr>
+            <w:r>
+              <w:rPr>
+                <w:rFonts w:ascii="Arial" w:hAnsi="Arial"/>
+                <w:b w:val="0"/>
+                <w:sz w:val="20"/>
+              </w:rPr>
+              <w:t>0.35</w:t>
+            </w:r>
+          </w:p>
+        </w:tc>
+      </w:tr>
+      <w:tr>
+        <w:tc>
+          <w:tcPr>
+            <w:tcW w:type="dxa" w:w="4801"/>
+            <w:vAlign w:val="center"/>
+          </w:tcPr>
+          <w:p>
+            <w:pPr>
+              <w:jc w:val="left"/>
+            </w:pPr>
+            <w:r>
+              <w:rPr>
+                <w:rFonts w:ascii="Arial" w:hAnsi="Arial"/>
+                <w:b w:val="0"/>
+                <w:sz w:val="20"/>
+              </w:rPr>
+              <w:t>Poisson's Ratio (Subgrade Soil)</w:t>
+            </w:r>
+          </w:p>
+        </w:tc>
+        <w:tc>
+          <w:tcPr>
+            <w:tcW w:type="dxa" w:w="4801"/>
+            <w:vAlign w:val="center"/>
+          </w:tcPr>
+          <w:p>
+            <w:pPr>
+              <w:jc w:val="center"/>
+            </w:pPr>
+            <w:r>
+              <w:rPr>
+                <w:rFonts w:ascii="Arial" w:hAnsi="Arial"/>
+                <w:b w:val="0"/>
+                <w:sz w:val="20"/>
+              </w:rPr>
+              <w:t>0.35</w:t>
+            </w:r>
+          </w:p>
+        </w:tc>
+      </w:tr>
+      <w:tr>
+        <w:tc>
+          <w:tcPr>
+            <w:tcW w:type="dxa" w:w="4801"/>
+            <w:vAlign w:val="center"/>
+          </w:tcPr>
+          <w:p>
+            <w:pPr>
+              <w:jc w:val="left"/>
+            </w:pPr>
+            <w:r>
+              <w:rPr>
+                <w:rFonts w:ascii="Arial" w:hAnsi="Arial"/>
+                <w:b w:val="0"/>
+                <w:sz w:val="20"/>
+              </w:rPr>
+              <w:t>Poisson's Ratio (Cement Treated Base - CTB)</w:t>
+            </w:r>
+          </w:p>
+        </w:tc>
+        <w:tc>
+          <w:tcPr>
+            <w:tcW w:type="dxa" w:w="4801"/>
+            <w:vAlign w:val="center"/>
+          </w:tcPr>
+          <w:p>
+            <w:pPr>
+              <w:jc w:val="center"/>
+            </w:pPr>
+            <w:r>
+              <w:rPr>
+                <w:rFonts w:ascii="Arial" w:hAnsi="Arial"/>
+                <w:b w:val="0"/>
+                <w:sz w:val="20"/>
+              </w:rPr>
+              <w:t>0.25</w:t>
+            </w:r>
+          </w:p>
+        </w:tc>
+      </w:tr>
+      <w:tr>
+        <w:tc>
+          <w:tcPr>
+            <w:tcW w:type="dxa" w:w="4801"/>
+            <w:vAlign w:val="center"/>
+          </w:tcPr>
+          <w:p>
+            <w:pPr>
+              <w:jc w:val="left"/>
+            </w:pPr>
+            <w:r>
+              <w:rPr>
+                <w:rFonts w:ascii="Arial" w:hAnsi="Arial"/>
+                <w:b w:val="0"/>
+                <w:sz w:val="20"/>
+              </w:rPr>
+              <w:t>Poisson's Ratio (Cement Treated Sub-grade/Sub-base - CTS)</w:t>
+            </w:r>
+          </w:p>
+        </w:tc>
+        <w:tc>
+          <w:tcPr>
+            <w:tcW w:type="dxa" w:w="4801"/>
+            <w:vAlign w:val="center"/>
+          </w:tcPr>
+          <w:p>
+            <w:pPr>
+              <w:jc w:val="center"/>
+            </w:pPr>
+            <w:r>
+              <w:rPr>
+                <w:rFonts w:ascii="Arial" w:hAnsi="Arial"/>
+                <w:b w:val="0"/>
+                <w:sz w:val="20"/>
+              </w:rPr>
+              <w:t>0.25</w:t>
+            </w:r>
+          </w:p>
+        </w:tc>
+      </w:tr>
+      <w:tr>
+        <w:tc>
+          <w:tcPr>
+            <w:tcW w:type="dxa" w:w="4801"/>
+            <w:vAlign w:val="center"/>
+          </w:tcPr>
+          <w:p>
+            <w:pPr>
+              <w:jc w:val="left"/>
+            </w:pPr>
+            <w:r>
+              <w:rPr>
+                <w:rFonts w:ascii="Arial" w:hAnsi="Arial"/>
+                <w:b w:val="0"/>
+                <w:sz w:val="20"/>
+              </w:rPr>
+              <w:t>Design Traffic Growth Rate</w:t>
+            </w:r>
+          </w:p>
+        </w:tc>
+        <w:tc>
+          <w:tcPr>
+            <w:tcW w:type="dxa" w:w="4801"/>
+            <w:vAlign w:val="center"/>
+          </w:tcPr>
+          <w:p>
+            <w:pPr>
+              <w:jc w:val="center"/>
+            </w:pPr>
+            <w:r>
+              <w:rPr>
+                <w:rFonts w:ascii="Arial" w:hAnsi="Arial"/>
+                <w:b w:val="0"/>
+                <w:sz w:val="20"/>
+              </w:rPr>
+              <w:t>5.0 %</w:t>
+            </w:r>
+          </w:p>
+        </w:tc>
+      </w:tr>
+      <w:tr>
+        <w:tc>
+          <w:tcPr>
+            <w:tcW w:type="dxa" w:w="4801"/>
+            <w:vAlign w:val="center"/>
+          </w:tcPr>
+          <w:p>
+            <w:pPr>
+              <w:jc w:val="left"/>
+            </w:pPr>
+            <w:r>
+              <w:rPr>
+                <w:rFonts w:ascii="Arial" w:hAnsi="Arial"/>
+                <w:b w:val="0"/>
+                <w:sz w:val="20"/>
+              </w:rPr>
+              <w:t>Subgrade Soil Behavior Modulus Relation</w:t>
+            </w:r>
+          </w:p>
+        </w:tc>
+        <w:tc>
+          <w:tcPr>
+            <w:tcW w:type="dxa" w:w="4801"/>
+            <w:vAlign w:val="center"/>
+          </w:tcPr>
+          <w:p>
+            <w:pPr>
+              <w:jc w:val="center"/>
+            </w:pPr>
+            <w:r>
+              <w:rPr>
+                <w:rFonts w:ascii="Arial" w:hAnsi="Arial"/>
+                <w:b w:val="0"/>
+                <w:sz w:val="20"/>
+              </w:rPr>
+              <w:t>IRC:37-2018 Formulae (MR = 17.6 * CBR^0.64 for CBR &gt; 5)</w:t>
+            </w:r>
+          </w:p>
+        </w:tc>
+      </w:tr>
+    </w:tbl>
+    <w:p>
+      <w:r>
+        <w:br w:type="page"/>
+      </w:r>
+    </w:p>
+    <w:p>
+      <w:pPr>
+        <w:spacing w:before="160" w:after="80"/>
+        <w:jc w:val="left"/>
+      </w:pPr>
+      <w:r>
+        <w:rPr>
+          <w:rFonts w:ascii="Arial" w:hAnsi="Arial"/>
+          <w:b/>
+          <w:color w:val="1F3A68"/>
+          <w:sz w:val="28"/>
+        </w:rPr>
+        <w:t>LIMITATIONS OF THE REPORT</w:t>
+      </w:r>
+    </w:p>
+    <w:p>
+      <w:pPr>
+        <w:jc w:val="left"/>
+      </w:pPr>
+      <w:r>
+        <w:rPr>
+          <w:rFonts w:ascii="Arial" w:hAnsi="Arial"/>
+          <w:b w:val="0"/>
+          <w:i w:val="0"/>
+          <w:sz w:val="22"/>
+        </w:rPr>
+        <w:t>1. This pavement design report is prepared as a decision-support guide for the client and the design engineers. It does not constitute official government approval or official regulatory stamp.</w:t>
+      </w:r>
+    </w:p>
+    <w:p>
+      <w:pPr>
+        <w:jc w:val="left"/>
+      </w:pPr>
+      <w:r>
+        <w:rPr>
+          <w:rFonts w:ascii="Arial" w:hAnsi="Arial"/>
+          <w:b w:val="0"/>
+          <w:i w:val="0"/>
+          <w:sz w:val="22"/>
+        </w:rPr>
+        <w:t>2. The layer thicknesses, material properties, and traffic projections are calculated using subgrade soils and traffic data inputs supplied by the client. Any variations in site conditions, soil properties, or traffic loads must be verified in the field and the design updated accordingly.</w:t>
+      </w:r>
+    </w:p>
+    <w:p>
+      <w:pPr>
+        <w:jc w:val="left"/>
+      </w:pPr>
+      <w:r>
+        <w:rPr>
+          <w:rFonts w:ascii="Arial" w:hAnsi="Arial"/>
+          <w:b w:val="0"/>
+          <w:i w:val="0"/>
+          <w:sz w:val="22"/>
+        </w:rPr>
+        <w:t>3. Final execution of the pavement construction works requires a detailed site-specific verification, structural validation, and formal sign-off/approval by a qualified pavement engineer.</w:t>
+      </w:r>
+    </w:p>
+    <w:p>
+      <w:r>
+        <w:br w:type="page"/>
+      </w:r>
+    </w:p>
+    <w:p>
+      <w:pPr>
+        <w:spacing w:before="160" w:after="80"/>
+        <w:jc w:val="left"/>
+      </w:pPr>
+      <w:r>
+        <w:rPr>
+          <w:rFonts w:ascii="Arial" w:hAnsi="Arial"/>
+          <w:b/>
+          <w:color w:val="1F3A68"/>
+          <w:sz w:val="28"/>
+        </w:rPr>
+        <w:t>ENGINEER REVIEW CHECKLIST</w:t>
+      </w:r>
+    </w:p>
+    <w:p>
+      <w:pPr>
+        <w:jc w:val="left"/>
+      </w:pPr>
+      <w:r>
+        <w:rPr>
+          <w:rFonts w:ascii="Arial" w:hAnsi="Arial"/>
+          <w:b w:val="0"/>
+          <w:i w:val="0"/>
+          <w:sz w:val="22"/>
+        </w:rPr>
+        <w:t>Review checklists completed by the certifying pavement engineer:</w:t>
+      </w:r>
+    </w:p>
+    <w:tbl>
+      <w:tblPr>
+        <w:tblStyle w:val="TableGrid"/>
+        <w:tblW w:type="auto" w:w="0"/>
+        <w:jc w:val="center"/>
+        <w:tblLook w:firstColumn="1" w:firstRow="1" w:lastColumn="0" w:lastRow="0" w:noHBand="0" w:noVBand="1" w:val="04A0"/>
+      </w:tblPr>
+      <w:tblGrid>
+        <w:gridCol w:w="4801"/>
+        <w:gridCol w:w="4801"/>
+      </w:tblGrid>
+      <w:tr>
+        <w:tc>
+          <w:tcPr>
+            <w:tcW w:type="dxa" w:w="4801"/>
+            <w:shd w:val="clear" w:color="auto" w:fill="1F3A68"/>
+            <w:vAlign w:val="center"/>
+          </w:tcPr>
+          <w:p>
+            <w:pPr>
+              <w:jc w:val="center"/>
+            </w:pPr>
+            <w:r>
+              <w:rPr>
+                <w:rFonts w:ascii="Arial" w:hAnsi="Arial"/>
+                <w:b/>
+                <w:color w:val="FFFFFF"/>
+                <w:sz w:val="20"/>
+              </w:rPr>
+              <w:t>Verification Checklist Item</w:t>
+            </w:r>
+          </w:p>
+        </w:tc>
+        <w:tc>
+          <w:tcPr>
+            <w:tcW w:type="dxa" w:w="4801"/>
+            <w:shd w:val="clear" w:color="auto" w:fill="1F3A68"/>
+            <w:vAlign w:val="center"/>
+          </w:tcPr>
+          <w:p>
+            <w:pPr>
+              <w:jc w:val="center"/>
+            </w:pPr>
+            <w:r>
+              <w:rPr>
+                <w:rFonts w:ascii="Arial" w:hAnsi="Arial"/>
+                <w:b/>
+                <w:color w:val="FFFFFF"/>
+                <w:sz w:val="20"/>
+              </w:rPr>
+              <w:t>Status / Remarks</w:t>
+            </w:r>
+          </w:p>
+        </w:tc>
+      </w:tr>
+      <w:tr>
+        <w:tc>
+          <w:tcPr>
+            <w:tcW w:type="dxa" w:w="4801"/>
+            <w:vAlign w:val="center"/>
+          </w:tcPr>
+          <w:p>
+            <w:pPr>
+              <w:jc w:val="left"/>
+            </w:pPr>
+            <w:r>
+              <w:rPr>
+                <w:rFonts w:ascii="Arial" w:hAnsi="Arial"/>
+                <w:b w:val="0"/>
+                <w:sz w:val="20"/>
+              </w:rPr>
+              <w:t>Review Workflow Status</w:t>
+            </w:r>
+          </w:p>
+        </w:tc>
+        <w:tc>
+          <w:tcPr>
+            <w:tcW w:type="dxa" w:w="4801"/>
+            <w:vAlign w:val="center"/>
+          </w:tcPr>
+          <w:p>
+            <w:pPr>
+              <w:jc w:val="center"/>
+            </w:pPr>
+            <w:r>
+              <w:rPr>
+                <w:rFonts w:ascii="Arial" w:hAnsi="Arial"/>
+                <w:b w:val="0"/>
+                <w:sz w:val="20"/>
+              </w:rPr>
+              <w:t>Draft</w:t>
+            </w:r>
+          </w:p>
+        </w:tc>
+      </w:tr>
+      <w:tr>
+        <w:tc>
+          <w:tcPr>
+            <w:tcW w:type="dxa" w:w="4801"/>
+            <w:vAlign w:val="center"/>
+          </w:tcPr>
+          <w:p>
+            <w:pPr>
+              <w:jc w:val="left"/>
+            </w:pPr>
+            <w:r>
+              <w:rPr>
+                <w:rFonts w:ascii="Arial" w:hAnsi="Arial"/>
+                <w:b w:val="0"/>
+                <w:sz w:val="20"/>
+              </w:rPr>
+              <w:t>Design Review Checklist Completed</w:t>
+            </w:r>
+          </w:p>
+        </w:tc>
+        <w:tc>
+          <w:tcPr>
+            <w:tcW w:type="dxa" w:w="4801"/>
+            <w:vAlign w:val="center"/>
+          </w:tcPr>
+          <w:p>
+            <w:pPr>
+              <w:jc w:val="center"/>
+            </w:pPr>
+            <w:r>
+              <w:rPr>
+                <w:rFonts w:ascii="Arial" w:hAnsi="Arial"/>
+                <w:b w:val="0"/>
+                <w:sz w:val="20"/>
+              </w:rPr>
+              <w:t>NO</w:t>
+            </w:r>
+          </w:p>
+        </w:tc>
+      </w:tr>
+      <w:tr>
+        <w:tc>
+          <w:tcPr>
+            <w:tcW w:type="dxa" w:w="4801"/>
+            <w:vAlign w:val="center"/>
+          </w:tcPr>
+          <w:p>
+            <w:pPr>
+              <w:jc w:val="left"/>
+            </w:pPr>
+            <w:r>
+              <w:rPr>
+                <w:rFonts w:ascii="Arial" w:hAnsi="Arial"/>
+                <w:b w:val="0"/>
+                <w:sz w:val="20"/>
+              </w:rPr>
+              <w:t>Input Verification Completed</w:t>
+            </w:r>
+          </w:p>
+        </w:tc>
+        <w:tc>
+          <w:tcPr>
+            <w:tcW w:type="dxa" w:w="4801"/>
+            <w:vAlign w:val="center"/>
+          </w:tcPr>
+          <w:p>
+            <w:pPr>
+              <w:jc w:val="center"/>
+            </w:pPr>
+            <w:r>
+              <w:rPr>
+                <w:rFonts w:ascii="Arial" w:hAnsi="Arial"/>
+                <w:b w:val="0"/>
+                <w:sz w:val="20"/>
+              </w:rPr>
+              <w:t>NO</w:t>
+            </w:r>
+          </w:p>
+        </w:tc>
+      </w:tr>
+      <w:tr>
+        <w:tc>
+          <w:tcPr>
+            <w:tcW w:type="dxa" w:w="4801"/>
+            <w:vAlign w:val="center"/>
+          </w:tcPr>
+          <w:p>
+            <w:pPr>
+              <w:jc w:val="left"/>
+            </w:pPr>
+            <w:r>
+              <w:rPr>
+                <w:rFonts w:ascii="Arial" w:hAnsi="Arial"/>
+                <w:b w:val="0"/>
+                <w:sz w:val="20"/>
+              </w:rPr>
+              <w:t>Traffic Assumptions Verified</w:t>
+            </w:r>
+          </w:p>
+        </w:tc>
+        <w:tc>
+          <w:tcPr>
+            <w:tcW w:type="dxa" w:w="4801"/>
+            <w:vAlign w:val="center"/>
+          </w:tcPr>
+          <w:p>
+            <w:pPr>
+              <w:jc w:val="center"/>
+            </w:pPr>
+            <w:r>
+              <w:rPr>
+                <w:rFonts w:ascii="Arial" w:hAnsi="Arial"/>
+                <w:b w:val="0"/>
+                <w:sz w:val="20"/>
+              </w:rPr>
+              <w:t>NO</w:t>
+            </w:r>
+          </w:p>
+        </w:tc>
+      </w:tr>
+      <w:tr>
+        <w:tc>
+          <w:tcPr>
+            <w:tcW w:type="dxa" w:w="4801"/>
+            <w:vAlign w:val="center"/>
+          </w:tcPr>
+          <w:p>
+            <w:pPr>
+              <w:jc w:val="left"/>
+            </w:pPr>
+            <w:r>
+              <w:rPr>
+                <w:rFonts w:ascii="Arial" w:hAnsi="Arial"/>
+                <w:b w:val="0"/>
+                <w:sz w:val="20"/>
+              </w:rPr>
+              <w:t>Material Assumptions Verified</w:t>
+            </w:r>
+          </w:p>
+        </w:tc>
+        <w:tc>
+          <w:tcPr>
+            <w:tcW w:type="dxa" w:w="4801"/>
+            <w:vAlign w:val="center"/>
+          </w:tcPr>
+          <w:p>
+            <w:pPr>
+              <w:jc w:val="center"/>
+            </w:pPr>
+            <w:r>
+              <w:rPr>
+                <w:rFonts w:ascii="Arial" w:hAnsi="Arial"/>
+                <w:b w:val="0"/>
+                <w:sz w:val="20"/>
+              </w:rPr>
+              <w:t>NO</w:t>
+            </w:r>
+          </w:p>
+        </w:tc>
+      </w:tr>
+      <w:tr>
+        <w:tc>
+          <w:tcPr>
+            <w:tcW w:type="dxa" w:w="4801"/>
+            <w:vAlign w:val="center"/>
+          </w:tcPr>
+          <w:p>
+            <w:pPr>
+              <w:jc w:val="left"/>
+            </w:pPr>
+            <w:r>
+              <w:rPr>
+                <w:rFonts w:ascii="Arial" w:hAnsi="Arial"/>
+                <w:b w:val="0"/>
+                <w:sz w:val="20"/>
+              </w:rPr>
+              <w:t>IITPAVE Verification Status</w:t>
+            </w:r>
+          </w:p>
+        </w:tc>
+        <w:tc>
+          <w:tcPr>
+            <w:tcW w:type="dxa" w:w="4801"/>
+            <w:vAlign w:val="center"/>
+          </w:tcPr>
+          <w:p>
+            <w:pPr>
+              <w:jc w:val="center"/>
+            </w:pPr>
+            <w:r>
+              <w:rPr>
+                <w:rFonts w:ascii="Arial" w:hAnsi="Arial"/>
+                <w:b w:val="0"/>
+                <w:sz w:val="20"/>
+              </w:rPr>
+              <w:t>Not Verified</w:t>
+            </w:r>
+          </w:p>
+        </w:tc>
+      </w:tr>
+      <w:tr>
+        <w:tc>
+          <w:tcPr>
+            <w:tcW w:type="dxa" w:w="4801"/>
+            <w:vAlign w:val="center"/>
+          </w:tcPr>
+          <w:p>
+            <w:pPr>
+              <w:jc w:val="left"/>
+            </w:pPr>
+            <w:r>
+              <w:rPr>
+                <w:rFonts w:ascii="Arial" w:hAnsi="Arial"/>
+                <w:b w:val="0"/>
+                <w:sz w:val="20"/>
+              </w:rPr>
+              <w:t>Final Reviewer Notes / Remarks</w:t>
+            </w:r>
+          </w:p>
+        </w:tc>
+        <w:tc>
+          <w:tcPr>
+            <w:tcW w:type="dxa" w:w="4801"/>
+            <w:vAlign w:val="center"/>
+          </w:tcPr>
+          <w:p>
+            <w:pPr>
+              <w:jc w:val="center"/>
+            </w:pPr>
+            <w:r>
+              <w:rPr>
+                <w:rFonts w:ascii="Arial" w:hAnsi="Arial"/>
+                <w:b w:val="0"/>
+                <w:sz w:val="20"/>
+              </w:rPr>
+              <w:t>No remarks added.</w:t>
+            </w:r>
+          </w:p>
+        </w:tc>
+      </w:tr>
+    </w:tbl>
+    <w:p>
+      <w:r>
+        <w:br w:type="page"/>
+      </w:r>
+    </w:p>
+    <w:p>
+      <w:pPr>
+        <w:spacing w:before="160" w:after="80"/>
+        <w:jc w:val="left"/>
+      </w:pPr>
+      <w:r>
+        <w:rPr>
+          <w:rFonts w:ascii="Arial" w:hAnsi="Arial"/>
+          <w:b/>
+          <w:color w:val="1F3A68"/>
+          <w:sz w:val="24"/>
+        </w:rPr>
+        <w:t>ENGINEERING SIGN-OFF AND SEAL</w:t>
+      </w:r>
+    </w:p>
+    <w:p>
+      <w:pPr>
+        <w:jc w:val="left"/>
+      </w:pPr>
+      <w:r>
+        <w:rPr>
+          <w:rFonts w:ascii="Arial" w:hAnsi="Arial"/>
+          <w:b w:val="0"/>
+          <w:i w:val="0"/>
+          <w:sz w:val="22"/>
+        </w:rPr>
+      </w:r>
+    </w:p>
+    <w:p>
+      <w:pPr>
+        <w:jc w:val="left"/>
+      </w:pPr>
+      <w:r>
+        <w:rPr>
+          <w:rFonts w:ascii="Arial" w:hAnsi="Arial"/>
+          <w:b w:val="0"/>
+          <w:i w:val="0"/>
+          <w:sz w:val="22"/>
+        </w:rPr>
+      </w:r>
+    </w:p>
+    <w:p>
+      <w:pPr>
+        <w:jc w:val="left"/>
+      </w:pPr>
+      <w:r>
+        <w:rPr>
+          <w:rFonts w:ascii="Arial" w:hAnsi="Arial"/>
+          <w:b/>
+          <w:i w:val="0"/>
+          <w:sz w:val="22"/>
+        </w:rPr>
+        <w:t xml:space="preserve">  ___________________________________________</w:t>
+      </w:r>
+    </w:p>
+    <w:p>
+      <w:pPr>
+        <w:jc w:val="left"/>
+      </w:pPr>
+      <w:r>
+        <w:rPr>
+          <w:rFonts w:ascii="Arial" w:hAnsi="Arial"/>
+          <w:b w:val="0"/>
+          <w:i w:val="0"/>
+          <w:sz w:val="22"/>
+        </w:rPr>
+        <w:t xml:space="preserve">  Signature of Reviewing Engineer</w:t>
+      </w:r>
+    </w:p>
+    <w:p>
+      <w:pPr>
+        <w:jc w:val="left"/>
+      </w:pPr>
+      <w:r>
+        <w:rPr>
+          <w:rFonts w:ascii="Arial" w:hAnsi="Arial"/>
+          <w:b w:val="0"/>
+          <w:i w:val="0"/>
+          <w:sz w:val="22"/>
+        </w:rPr>
+      </w:r>
+    </w:p>
+    <w:p>
+      <w:pPr>
+        <w:jc w:val="left"/>
+      </w:pPr>
+      <w:r>
+        <w:rPr>
+          <w:rFonts w:ascii="Arial" w:hAnsi="Arial"/>
+          <w:b w:val="0"/>
+          <w:i w:val="0"/>
+          <w:sz w:val="22"/>
+        </w:rPr>
+        <w:t xml:space="preserve">  Date: _____________________________________</w:t>
+      </w:r>
+    </w:p>
+    <w:p>
+      <w:pPr>
+        <w:jc w:val="left"/>
+      </w:pPr>
+      <w:r>
+        <w:rPr>
+          <w:rFonts w:ascii="Arial" w:hAnsi="Arial"/>
+          <w:b w:val="0"/>
+          <w:i w:val="0"/>
+          <w:sz w:val="22"/>
+        </w:rPr>
+      </w:r>
+    </w:p>
+    <w:p>
+      <w:pPr>
+        <w:jc w:val="left"/>
+      </w:pPr>
+      <w:r>
+        <w:rPr>
+          <w:rFonts w:ascii="Arial" w:hAnsi="Arial"/>
+          <w:b w:val="0"/>
+          <w:i w:val="0"/>
+          <w:sz w:val="22"/>
+        </w:rPr>
+        <w:t xml:space="preserve">  Seal / Registration No: ____________________</w:t>
+      </w:r>
+    </w:p>
     <w:sectPr>
       <w:footerReference w:type="default" r:id="rId9"/>
       <w:pgSz w:w="11906" w:h="16838"/>

</xml_diff>